<commit_message>
Add elastic net and reduced-rank regression check, PLOS build script, updated manuscript
</commit_message>
<xml_diff>
--- a/manuscript/ion_channel_full_article.docx
+++ b/manuscript/ion_channel_full_article.docx
@@ -182,7 +182,7 @@
         <w:rPr>
           <w:color w:val="000000"/>
         </w:rPr>
-        <w:t xml:space="preserve">Using 390 channel genes and the 29 released electrophysiological features of 1,304 to 1,328 motor cortex neurons, cross-validated ridge regression reproduces the published pattern (mean R² 0.244 across features). Action potential waveform and firing features are predicted best: upstroke-to-downstroke ratio 0.681, maximum number of action potentials 0.665, action potential width 0.646 and afterhyperpolarization 0.536. Input resistance reaches 0.424 and resting membrane potential 0.117. These values agree with the preprint version of this analysis to within 0.03 for every feature named here.</w:t>
+        <w:t xml:space="preserve">Using 390 channel genes and the 29 released electrophysiological features of 1,304 to 1,328 motor cortex neurons, cross-validated ridge regression reproduces the published pattern (mean R² 0.244 across features). Action potential waveform and firing features are predicted best: upstroke-to-downstroke ratio 0.681, maximum number of action potentials 0.665, action potential width 0.646 and afterhyperpolarization 0.536. Input resistance reaches 0.424 and resting membrane potential 0.117.</w:t>
       </w:r>
     </w:p>
     <w:bookmarkEnd w:id="22"/>
@@ -228,7 +228,7 @@
         <w:rPr>
           <w:color w:val="000000"/>
         </w:rPr>
-        <w:t xml:space="preserve">The collapse is not specific to ridge regression. In the preprint version of this analysis, per-feature elastic net gave a mean within-type R² of -0.0012 and sparse reduced-rank regression (Kobak et al. 2021), the estimator class used by Bernaerts et al., gave -0.083 at rank 2, with all 29 features at or below zero.</w:t>
+        <w:t xml:space="preserve">The collapse is not specific to ridge regression. On the same cells and folds, per-feature elastic net reaches a mean raw R² of 0.273 and a mean within-type R² of 0.0008. Reduced-rank ridge regression, which predicts all 29 features jointly through a low-rank bottleneck like the sparse reduced-rank regression used by Bernaerts et al. (Kobak et al. 2021), was fitted on the 946 cells with every feature measured. It reaches mean raw R² of 0.237 at rank 2 and 0.263 at rank 5, and mean within-type R² of 0.0010 and 0.0016; at rank 2, 17 of 29 features are at or below zero.</w:t>
       </w:r>
     </w:p>
     <w:p>
@@ -414,7 +414,7 @@
         <w:rPr>
           <w:color w:val="000000"/>
         </w:rPr>
-        <w:t xml:space="preserve">Hcn1 to Hcn4 together predict sag ratio within type above random four-gene channel sets (R² 0.0075, p = 0.018), as well as sag time (0.0074, p = 0.026); sag area is borderline (0.0039, p = 0.060). Rebound (p = 0.59), membrane time constant (p = 0.80), resting potential (p = 0.10) and action potential width (p = 0.06) are not significant. Dropping Hcn1 removes the effect for all three sag measures (sag ratio -0.0023), while Hcn1 alone does slightly better than the four genes together (0.012 for sag ratio). These numbers reproduce the preprint. Because Hcn1 was singled out after the four-gene test, and the effect is small, this remains suggestive.</w:t>
+        <w:t xml:space="preserve">Hcn1 to Hcn4 together predict sag ratio within type above random four-gene channel sets (R² 0.0075, p = 0.018; Figure 5), as well as sag time (0.0074, p = 0.026); sag area is borderline (0.0039, p = 0.060). Rebound (p = 0.59), membrane time constant (p = 0.80), resting potential (p = 0.10) and action potential width (p = 0.06) are not significant. Dropping Hcn1 removes the effect for all three sag measures (sag ratio -0.0023), while Hcn1 alone does slightly better than the four genes together (0.012 for sag ratio). Because Hcn1 was singled out after the four-gene test, and the effect is small, this remains suggestive.</w:t>
       </w:r>
     </w:p>
     <w:p>
@@ -4879,7 +4879,7 @@
         <w:rPr>
           <w:color w:val="000000"/>
         </w:rPr>
-        <w:t xml:space="preserve">This fits older evidence that cells of one type reach similar behaviour with different channel complements (Schulz et al. 2006; Marder &amp; Goaillard 2006; Goaillard &amp; Marder 2021), the finding that many cross-type gene to property correlations are class-driven (Bomkamp et al. 2019), and the observation from this same dataset that types within a family are poorly separated electrophysiologically (Scala et al. 2021). Transcript abundance also captures only one factor of membrane conductance. Conductance depends on channel number, open probability and single-channel conductance, and the mRNA count is a noisy proxy for the first of these only. Trafficking, subunit composition and modulation are invisible to it.</w:t>
+        <w:t xml:space="preserve">This fits older evidence that cells of one type reach similar behaviour with different channel complements (Schulz et al. 2006; Marder &amp; Goaillard 2006; Goaillard &amp; Marder 2021), the finding that many cross-type gene to property correlations are class-driven (Bomkamp et al. 2019), and the observation from this same dataset that types within a family are poorly separated electrophysiologically (Scala et al. 2021). Biophysical models of cortical neurons point the same way: electrical features depend on synergistic combinations of conductances, whereas channel gene expression in single cells is dominated by redundancy (Reva et al. 2025). Transcript abundance also captures only one factor of membrane conductance. Conductance depends on channel number, open probability and single-channel conductance, and the mRNA count is a noisy proxy for the first of these only. Trafficking, subunit composition and modulation are invisible to it.</w:t>
       </w:r>
     </w:p>
     <w:bookmarkEnd w:id="30"/>
@@ -4903,7 +4903,7 @@
         <w:rPr>
           <w:color w:val="000000"/>
         </w:rPr>
-        <w:t xml:space="preserve">Bernaerts et al. (2025) attributed the loss of accuracy at the level of fine types to limited data. The preprint version of this paper argued the opposite, that the within-type quantity is too small for more data to matter. The power analysis here shows that argument went too far. At roughly 950 cells and 390 genes, a within-type effect of R² 0.05 is detected only about half the time, so the near-zero observed values are consistent with real effects of that size, and more cells would recover more of them.</w:t>
+        <w:t xml:space="preserve">Bernaerts et al. (2025) attributed the loss of accuracy at the level of fine types to limited data. The near-zero values invite the opposite reading, that the within-type quantity is too small for more data to matter. The power analysis shows that reading goes too far. At roughly 950 cells and 390 genes, a within-type effect of R² 0.05 is detected only about half the time, so the near-zero observed values are consistent with real effects of that size, and more cells would recover more of them.</w:t>
       </w:r>
     </w:p>
     <w:p>
@@ -5008,7 +5008,7 @@
         <w:rPr>
           <w:color w:val="000000"/>
         </w:rPr>
-        <w:t xml:space="preserve">All results come from one dataset, one brain region and one species. A script to repeat the main analysis on the larger mouse visual cortex Patch-seq release is provided but could not be run here because its count matrix was not reachable from the analysis environment. Transcriptomic types are defined from the transcriptome, partly including channel genes. Clusters built without any channel gene agreed only modestly with the published types and left more residual, so this check cannot exclude some circularity. The calibration assumes a linear, dense or sparse signal over the same genes; a nonlinear relationship could be recovered differently. Fitted model parameters are point estimates from a degenerate posterior, which attenuates raw and residual estimates alike. The elastic net and sRRR comparisons are carried over from the preprint rather than rerun. A learning curve was attempted and is not reported. Subsampling cells shrinks every type, and with fewer than about 10 cells per type both ways of removing type means are biased, in opposite directions, so the curve could not separate effect size from estimation error.</w:t>
+        <w:t xml:space="preserve">All results come from one dataset, one brain region and one species. A script to repeat the main analysis on the larger mouse visual cortex Patch-seq release is provided but could not be run here because its count matrix was not reachable from the analysis environment. Transcriptomic types are defined from the transcriptome, partly including channel genes. Clusters built without any channel gene agreed only modestly with the published types and left more residual, so this check cannot exclude some circularity. The calibration assumes a linear, dense or sparse signal over the same genes; a nonlinear relationship could be recovered differently. Fitted model parameters are point estimates from a degenerate posterior, which attenuates raw and residual estimates alike. A learning curve was attempted and is not reported. Subsampling cells shrinks every type, and with fewer than about 10 cells per type both ways of removing type means are biased, in opposite directions, so the curve could not separate effect size from estimation error.</w:t>
       </w:r>
     </w:p>
     <w:bookmarkEnd w:id="34"/>
@@ -5093,7 +5093,7 @@
         <w:rPr>
           <w:color w:val="000000"/>
         </w:rPr>
-        <w:t xml:space="preserve">Each feature was predicted with ridge regression under 10-fold cross-validation. Inside each training fold, predictors were standardized with training-fold statistics and the penalty was chosen by generalized cross-validation over 30 log-spaced values from 0.01 to 100,000. Test-fold standardized values were clipped to the range seen in the training fold; without this, a gene that is almost constant in one training fold produced extreme predictions for single test cells. R² was computed once on the pooled held-out predictions against the total sum of squares. Elastic net and sparse reduced-rank regression (sRRR) results are taken from the preprint version of this work and are labelled as such.</w:t>
+        <w:t xml:space="preserve">Each feature was predicted with ridge regression under 10-fold cross-validation. Inside each training fold, predictors were standardized with training-fold statistics and the penalty was chosen by generalized cross-validation over 30 log-spaced values from 0.01 to 100,000. Test-fold standardized values were clipped to the range seen in the training fold; without this, a gene that is almost constant in one training fold produced extreme predictions for single test cells. R² was computed once on the pooled held-out predictions against the total sum of squares. For comparison, the same outer folds were used with two other estimators. Elastic net was fitted per feature, with penalty strength (30 values) and l1 ratio (0.1, 0.5 or 0.9) chosen by inner 5-fold cross-validation in each training fold. Reduced-rank ridge regression fitted all 29 standardized features jointly: a ridge fit with the penalty chosen by generalized cross-validation, whose coefficients were then projected onto the top two or five right singular vectors of the fitted training values.</w:t>
       </w:r>
     </w:p>
     <w:bookmarkEnd w:id="38"/>
@@ -5237,7 +5237,7 @@
         <w:rPr>
           <w:color w:val="000000"/>
         </w:rPr>
-        <w:t xml:space="preserve">Within type, Hcn1 to Hcn4 were used as the only predictors for seven features and compared with 500 random sets of four other channel genes. Leave-one-gene-out and Hcn1-only fits were also run. The four-gene test and its features were specified in the preprint before it was first run.</w:t>
+        <w:t xml:space="preserve">Within type, Hcn1 to Hcn4 were used as the only predictors for seven features and compared with 500 random sets of four other channel genes. Leave-one-gene-out and Hcn1-only fits were also run. The four-gene test and its seven features were fixed before the test was first run.</w:t>
       </w:r>
     </w:p>
     <w:bookmarkEnd w:id="44"/>
@@ -5261,7 +5261,7 @@
         <w:rPr>
           <w:color w:val="000000"/>
         </w:rPr>
-        <w:t xml:space="preserve">A script that applies the same pipeline to the mouse visual cortex Patch-seq release (Gouwens et al. 2020; 23 features as extracted by Bernaerts et al. 2025) is provided. That release contains exon counts without gene lengths, so expression is log(1 + counts per million).</w:t>
+        <w:t xml:space="preserve">A script that applies the same pipeline to the mouse visual cortex Patch-seq release of Gouwens et al. (2020), using the 23 features extracted by Bernaerts et al. (2025), is provided. That release contains exon counts without gene lengths, so expression is log(1 + counts per million).</w:t>
       </w:r>
     </w:p>
     <w:bookmarkEnd w:id="45"/>
@@ -5940,6 +5940,17 @@
           <w:color w:val="000000"/>
         </w:rPr>
         <w:t xml:space="preserve">Prinz AA, Bucher D, Marder E. Similar network activity from disparate circuit parameters. Nat Neurosci. 2004;7(12):1345-1352. doi:10.1038/nn1352</w:t>
+      </w:r>
+    </w:p>
+    <w:p>
+      <w:pPr>
+        <w:pStyle w:val="BodyText"/>
+      </w:pPr>
+      <w:r>
+        <w:rPr>
+          <w:color w:val="000000"/>
+        </w:rPr>
+        <w:t xml:space="preserve">Reva M, Arnaudon A, Zbili M, Makkeh A, Markram H, Goaillard JM, Van Geit W. Higher-order interactions in neuronal function: from genes to ionic currents in biophysical models. Proc Natl Acad Sci U S A. 2025;122(40):e2500048122. doi:10.1073/pnas.2500048122</w:t>
       </w:r>
     </w:p>
     <w:p>

</xml_diff>

<commit_message>
Add Zenodo DOI to README and manuscript
</commit_message>
<xml_diff>
--- a/manuscript/ion_channel_full_article.docx
+++ b/manuscript/ion_channel_full_article.docx
@@ -5285,7 +5285,7 @@
         <w:rPr>
           <w:color w:val="000000"/>
         </w:rPr>
-        <w:t xml:space="preserve">Python 3 with NumPy, pandas and scikit-learn 1.9. All scripts download or read only public inputs and are available at https://github.com/immortal71/patchseq-within-type.</w:t>
+        <w:t xml:space="preserve">Python 3 with NumPy, pandas and scikit-learn 1.9. All scripts download or read only public inputs and are available at https://github.com/immortal71/patchseq-within-type and archived on Zenodo (https://doi.org/10.5281/zenodo.23451340).</w:t>
       </w:r>
     </w:p>
     <w:bookmarkEnd w:id="46"/>
@@ -5722,7 +5722,7 @@
         <w:rPr>
           <w:color w:val="000000"/>
         </w:rPr>
-        <w:t xml:space="preserve">All input data are public: github.com/berenslab/mini-atlas (Scala et al. 2021) and github.com/berenslab/hh_sbi (Bernaerts et al. 2025). Every analysis script, result table and figure script is available at https://github.com/immortal71/patchseq-within-type under the MIT licence. The visual cortex replication script requires the Allen Institute mouse visual cortex Patch-seq release (Gouwens et al. 2020).</w:t>
+        <w:t xml:space="preserve">All input data are public: github.com/berenslab/mini-atlas (Scala et al. 2021) and github.com/berenslab/hh_sbi (Bernaerts et al. 2025). Every analysis script, result table and figure script is available at https://github.com/immortal71/patchseq-within-type under the MIT licence and archived on Zenodo (https://doi.org/10.5281/zenodo.23451340). The visual cortex replication script requires the Allen Institute mouse visual cortex Patch-seq release (Gouwens et al. 2020).</w:t>
       </w:r>
     </w:p>
     <w:bookmarkEnd w:id="65"/>

</xml_diff>

<commit_message>
Manuscript: corrections from full recheck
</commit_message>
<xml_diff>
--- a/manuscript/ion_channel_full_article.docx
+++ b/manuscript/ion_channel_full_article.docx
@@ -56,7 +56,7 @@
         <w:rPr>
           <w:color w:val="000000"/>
         </w:rPr>
-        <w:t xml:space="preserve">Patch-seq datasets pair each neuron’s transcriptome with its electrophysiology, and several studies report that ion channel gene expression predicts electrophysiological features with high cross-validated accuracy. Here I ask how much of that accuracy reflects a relationship within a transcriptomic cell type rather than differences between types. In 1,328 mouse motor cortex neurons, ridge regression on 390 channel genes reproduces published accuracy (R² up to 0.68). On the same cells, removing type means from both expression and target reduces mean R² across 29 features from 0.270 to 0.0024. A within-type residual survives a permutation null for 12 features (7 after false discovery correction), largest for the number of action potentials, input resistance and membrane time constant; resting membrane potential shows none (p = 0.76). Because cross-validated R² strongly underestimates weak effects at this sample size, I calibrated it against planted effects of known size. The implied true within-type R² for the best-predicted features is about 0.05 to 0.10, about four to fourteen times below raw accuracy, and below 0.05 for resting potential. For 13 Hodgkin-Huxley parameters fitted to the same cells in previous work, within-type and within-family R² are indistinguishable from zero, so family-level prediction reflects family means. Results hold with a second, curated channel gene list. Raw accuracy in this setting mostly measures how separable cell types are. Larger datasets should improve within-type prediction, but toward a ceiling several times below current raw figures.</w:t>
+        <w:t xml:space="preserve">Patch-seq datasets pair each neuron’s transcriptome with its electrophysiology, and several studies report that ion channel gene expression predicts electrophysiological features with high cross-validated accuracy. Here I ask how much of that accuracy reflects a relationship within a transcriptomic cell type rather than differences between types. In 1,328 mouse motor cortex neurons, ridge regression on 390 channel genes gives accuracy close to published reports (R² up to 0.68). On the same cells, removing type means from both expression and target reduces mean R² across 29 features from 0.270 to 0.0024. A within-type residual survives a permutation null for 12 features (7 after false discovery correction), largest for the maximum number of action potentials, input resistance and spike latency; resting membrane potential shows none (p = 0.76). Because cross-validated R² strongly underestimates weak effects at this sample size, I calibrated it against planted effects of known size. The implied true within-type R² for the best-predicted features is about 0.05 to 0.10, about four to fourteen times below raw accuracy, and below 0.05 for resting potential. For 13 Hodgkin-Huxley parameters fitted to the same cells in previous work, within-type and within-family R² are indistinguishable from zero, so family-level prediction reflects family means. Results hold with a second, curated channel gene list. Raw accuracy in this setting mostly measures how separable cell types are. Larger datasets should improve within-type prediction, but toward a ceiling several times below current raw figures.</w:t>
       </w:r>
     </w:p>
     <w:p>
@@ -113,7 +113,7 @@
         <w:rPr>
           <w:color w:val="000000"/>
         </w:rPr>
-        <w:t xml:space="preserve">Older work points to a different explanation. In identified crustacean neurons, channel mRNA and current vary two- to fourfold between animals while firing stays similar (Schulz et al. 2006), and many different conductance combinations can produce the same behaviour (Prinz et al. 2004; Marder &amp; Goaillard 2006; Goaillard &amp; Marder 2021). In mouse motor cortex itself, Scala et al. (2021) found that types within a family are poorly separated in electrophysiological space. Bomkamp et al. (2019) showed that many gene to property correlations across cell types are driven by the split between excitatory and inhibitory classes, and that only some of them carry over to variation within a type. If within-type variation in channel expression carries little information about within-type variation in physiology, the accuracy reported across all cells comes mostly from identifying the cell type, and more data can only recover a within-type relationship of whatever size actually exists.</w:t>
+        <w:t xml:space="preserve">Older work points to a different explanation. In identified crustacean neurons, channel mRNA and current vary two- to fourfold between animals while firing stays similar (Schulz et al. 2006), and many different conductance combinations can produce the same behavior (Prinz et al. 2004; Marder &amp; Goaillard 2006; Goaillard &amp; Marder 2021). In mouse motor cortex itself, Scala et al. (2021) found that types within a family are poorly separated in electrophysiological space. Bomkamp et al. (2019) showed that many gene to property correlations across cell types are driven by the split between excitatory and inhibitory classes, and that only some of them carry over to variation within a type. If within-type variation in channel expression carries little information about within-type variation in physiology, the accuracy reported across all cells comes mostly from identifying the cell type, and more data can only recover a within-type relationship of whatever size actually exists.</w:t>
       </w:r>
     </w:p>
     <w:p>
@@ -217,7 +217,7 @@
         <w:rPr>
           <w:color w:val="000000"/>
         </w:rPr>
-        <w:t xml:space="preserve">Raw accuracy still ranks features sensibly. Across the 29 features, raw and within-type R² are correlated (Spearman ρ = 0.75, p &lt; 0.0001; Figure 1b). The observed within-type values, however, are 30 to 250 times smaller than the raw values for the best predicted features.</w:t>
+        <w:t xml:space="preserve">Raw accuracy still ranks features sensibly. Across the 29 features, raw and within-type R² are correlated (Spearman ρ = 0.75, p &lt; 0.0001; Figure 1b). The observed within-type values, however, are about 30 to 260 times smaller than the raw values for the best predicted features.</w:t>
       </w:r>
     </w:p>
     <w:p>
@@ -355,7 +355,7 @@
         <w:rPr>
           <w:color w:val="000000"/>
         </w:rPr>
-        <w:t xml:space="preserve">Reproducing the preprocessing of Bernaerts et al. (2025) exactly (427 genes, 955 cells), raw R² for the 13 fitted parameters averages 0.173, and the ranking matches theirs: the steady-state ratio r_SS is predicted best (0.619), then the delayed-rectifier and Kv3.1 conductances (0.308 and 0.282) and membrane capacitance (0.277), with the muscarinic conductance and leak reversal potential worst (0.015 and 0.032). Within transcriptomic type (19 types with at least 15 cells, 668 cells), mean R² is -0.0045 and 12 of 13 parameters are at or below zero (Figure 3). Only the spike threshold parameter VT passes its permutation null (R² 0.008, p = 0.04), which is the number expected by chance among 13 tests.</w:t>
+        <w:t xml:space="preserve">Reproducing the preprocessing of Bernaerts et al. (2025) exactly (427 genes, 955 cells), raw R² for the 13 fitted parameters averages 0.173, and the ranking matches theirs: the steady-state ratio r_SS is predicted best (0.619), then the delayed-rectifier and Kv3.1 conductances (0.308 and 0.282) and membrane capacitance (0.277), with the muscarinic and sodium conductances worst (0.015 and 0.025). Within transcriptomic type (19 types with at least 15 cells, 668 cells), mean R² is -0.0045 and 12 of 13 parameters are at or below zero (Figure 3). Only the spike threshold parameter VT passes its permutation null (R² 0.008, p = 0.04), which is the number expected by chance among 13 tests.</w:t>
       </w:r>
     </w:p>
     <w:p>
@@ -403,7 +403,21 @@
         <w:rPr>
           <w:color w:val="000000"/>
         </w:rPr>
-        <w:t xml:space="preserve">The Ih-linked residual depends on Hcn1</w:t>
+        <w:t xml:space="preserve">The Ih-linked residual depends on</w:t>
+      </w:r>
+      <w:r>
+        <w:rPr>
+          <w:color w:val="000000"/>
+        </w:rPr>
+        <w:t xml:space="preserve"> </w:t>
+      </w:r>
+      <w:r>
+        <w:rPr>
+          <w:iCs/>
+          <w:i/>
+          <w:color w:val="000000"/>
+        </w:rPr>
+        <w:t xml:space="preserve">Hcn1</w:t>
       </w:r>
     </w:p>
     <w:p>
@@ -412,9 +426,127 @@
       </w:pPr>
       <w:r>
         <w:rPr>
-          <w:color w:val="000000"/>
-        </w:rPr>
-        <w:t xml:space="preserve">Hcn1 to Hcn4 together predict sag ratio within type above random four-gene channel sets (R² 0.0075, p = 0.018; Figure 5), as well as sag time (0.0074, p = 0.026); sag area is borderline (0.0039, p = 0.060). Rebound (p = 0.59), membrane time constant (p = 0.80), resting potential (p = 0.10) and action potential width (p = 0.06) are not significant. Dropping Hcn1 removes the effect for all three sag measures (sag ratio -0.0023), while Hcn1 alone does slightly better than the four genes together (0.012 for sag ratio). Because Hcn1 was singled out after the four-gene test, and the effect is small, this remains suggestive.</w:t>
+          <w:iCs/>
+          <w:i/>
+          <w:color w:val="000000"/>
+        </w:rPr>
+        <w:t xml:space="preserve">Hcn1</w:t>
+      </w:r>
+      <w:r>
+        <w:rPr>
+          <w:color w:val="000000"/>
+        </w:rPr>
+        <w:t xml:space="preserve"> </w:t>
+      </w:r>
+      <w:r>
+        <w:rPr>
+          <w:color w:val="000000"/>
+        </w:rPr>
+        <w:t xml:space="preserve">to</w:t>
+      </w:r>
+      <w:r>
+        <w:rPr>
+          <w:color w:val="000000"/>
+        </w:rPr>
+        <w:t xml:space="preserve"> </w:t>
+      </w:r>
+      <w:r>
+        <w:rPr>
+          <w:iCs/>
+          <w:i/>
+          <w:color w:val="000000"/>
+        </w:rPr>
+        <w:t xml:space="preserve">Hcn4</w:t>
+      </w:r>
+      <w:r>
+        <w:rPr>
+          <w:color w:val="000000"/>
+        </w:rPr>
+        <w:t xml:space="preserve"> </w:t>
+      </w:r>
+      <w:r>
+        <w:rPr>
+          <w:color w:val="000000"/>
+        </w:rPr>
+        <w:t xml:space="preserve">together predict sag ratio within type above random four-gene channel sets (R² 0.0075, p = 0.018; Figure 5), as well as sag time (0.0074, p = 0.026); sag area is borderline (0.0039, p = 0.060). Rebound (p = 0.59), membrane time constant (p = 0.80), resting potential (p = 0.10) and action potential width (p = 0.06) are not significant. Dropping</w:t>
+      </w:r>
+      <w:r>
+        <w:rPr>
+          <w:color w:val="000000"/>
+        </w:rPr>
+        <w:t xml:space="preserve"> </w:t>
+      </w:r>
+      <w:r>
+        <w:rPr>
+          <w:iCs/>
+          <w:i/>
+          <w:color w:val="000000"/>
+        </w:rPr>
+        <w:t xml:space="preserve">Hcn1</w:t>
+      </w:r>
+      <w:r>
+        <w:rPr>
+          <w:color w:val="000000"/>
+        </w:rPr>
+        <w:t xml:space="preserve"> </w:t>
+      </w:r>
+      <w:r>
+        <w:rPr>
+          <w:color w:val="000000"/>
+        </w:rPr>
+        <w:t xml:space="preserve">removes the effect for all three sag measures (sag ratio -0.0023), while</w:t>
+      </w:r>
+      <w:r>
+        <w:rPr>
+          <w:color w:val="000000"/>
+        </w:rPr>
+        <w:t xml:space="preserve"> </w:t>
+      </w:r>
+      <w:r>
+        <w:rPr>
+          <w:iCs/>
+          <w:i/>
+          <w:color w:val="000000"/>
+        </w:rPr>
+        <w:t xml:space="preserve">Hcn1</w:t>
+      </w:r>
+      <w:r>
+        <w:rPr>
+          <w:color w:val="000000"/>
+        </w:rPr>
+        <w:t xml:space="preserve"> </w:t>
+      </w:r>
+      <w:r>
+        <w:rPr>
+          <w:color w:val="000000"/>
+        </w:rPr>
+        <w:t xml:space="preserve">alone does slightly better than the four genes together (0.012 for sag ratio). Because</w:t>
+      </w:r>
+      <w:r>
+        <w:rPr>
+          <w:color w:val="000000"/>
+        </w:rPr>
+        <w:t xml:space="preserve"> </w:t>
+      </w:r>
+      <w:r>
+        <w:rPr>
+          <w:iCs/>
+          <w:i/>
+          <w:color w:val="000000"/>
+        </w:rPr>
+        <w:t xml:space="preserve">Hcn1</w:t>
+      </w:r>
+      <w:r>
+        <w:rPr>
+          <w:color w:val="000000"/>
+        </w:rPr>
+        <w:t xml:space="preserve"> </w:t>
+      </w:r>
+      <w:r>
+        <w:rPr>
+          <w:color w:val="000000"/>
+        </w:rPr>
+        <w:t xml:space="preserve">was singled out after the four-gene test, and the effect is small, this remains suggestive.</w:t>
       </w:r>
     </w:p>
     <w:p>
@@ -4879,7 +5011,7 @@
         <w:rPr>
           <w:color w:val="000000"/>
         </w:rPr>
-        <w:t xml:space="preserve">This fits older evidence that cells of one type reach similar behaviour with different channel complements (Schulz et al. 2006; Marder &amp; Goaillard 2006; Goaillard &amp; Marder 2021), the finding that many cross-type gene to property correlations are class-driven (Bomkamp et al. 2019), and the observation from this same dataset that types within a family are poorly separated electrophysiologically (Scala et al. 2021). Biophysical models of cortical neurons point the same way: electrical features depend on synergistic combinations of conductances, whereas channel gene expression in single cells is dominated by redundancy (Reva et al. 2025). Transcript abundance also captures only one factor of membrane conductance. Conductance depends on channel number, open probability and single-channel conductance, and the mRNA count is a noisy proxy for the first of these only. Trafficking, subunit composition and modulation are invisible to it.</w:t>
+        <w:t xml:space="preserve">This fits older evidence that cells of one type reach similar behavior with different channel complements (Schulz et al. 2006; Marder &amp; Goaillard 2006; Goaillard &amp; Marder 2021), the finding that many cross-type gene to property correlations are class-driven (Bomkamp et al. 2019), and the observation from this same dataset that types within a family are poorly separated electrophysiologically (Scala et al. 2021). Biophysical models of cortical neurons point the same way: electrical features depend on synergistic combinations of conductances, whereas channel gene expression in single cells is dominated by redundancy (Reva et al. 2025). Transcript abundance also captures only one factor of membrane conductance. Conductance depends on channel number, open probability and single-channel conductance, and the mRNA count is a noisy proxy for the first of these only. Trafficking, subunit composition and modulation are invisible to it.</w:t>
       </w:r>
     </w:p>
     <w:bookmarkEnd w:id="30"/>
@@ -4960,7 +5092,53 @@
         <w:rPr>
           <w:color w:val="000000"/>
         </w:rPr>
-        <w:t xml:space="preserve">The sag-related residual traces mainly to Hcn1. HCN channels have small single-channel conductance but are numerous and partly open near rest, so Ih may scale with channel number more directly than most currents. The model of Bernaerts et al. contains no hyperpolarization-activated current and was fitted to depolarizing steps, so it could not represent this effect even if present. The Hcn1 result was found after a four-gene test and is small; it needs replication in an independent dataset with hyperpolarizing protocols.</w:t>
+        <w:t xml:space="preserve">The sag-related residual traces mainly to</w:t>
+      </w:r>
+      <w:r>
+        <w:rPr>
+          <w:color w:val="000000"/>
+        </w:rPr>
+        <w:t xml:space="preserve"> </w:t>
+      </w:r>
+      <w:r>
+        <w:rPr>
+          <w:iCs/>
+          <w:i/>
+          <w:color w:val="000000"/>
+        </w:rPr>
+        <w:t xml:space="preserve">Hcn1</w:t>
+      </w:r>
+      <w:r>
+        <w:rPr>
+          <w:color w:val="000000"/>
+        </w:rPr>
+        <w:t xml:space="preserve">. HCN channels have small single-channel conductance but are numerous and partly open near rest, so Ih may scale with channel number more directly than most currents. The model of Bernaerts et al. contains no hyperpolarization-activated current and was fitted to depolarizing steps, so it could not represent this effect even if present. The</w:t>
+      </w:r>
+      <w:r>
+        <w:rPr>
+          <w:color w:val="000000"/>
+        </w:rPr>
+        <w:t xml:space="preserve"> </w:t>
+      </w:r>
+      <w:r>
+        <w:rPr>
+          <w:iCs/>
+          <w:i/>
+          <w:color w:val="000000"/>
+        </w:rPr>
+        <w:t xml:space="preserve">Hcn1</w:t>
+      </w:r>
+      <w:r>
+        <w:rPr>
+          <w:color w:val="000000"/>
+        </w:rPr>
+        <w:t xml:space="preserve"> </w:t>
+      </w:r>
+      <w:r>
+        <w:rPr>
+          <w:color w:val="000000"/>
+        </w:rPr>
+        <w:t xml:space="preserve">result was found after a four-gene test and is small; it needs replication in an independent dataset with hyperpolarizing protocols.</w:t>
       </w:r>
     </w:p>
     <w:bookmarkEnd w:id="32"/>
@@ -5008,7 +5186,7 @@
         <w:rPr>
           <w:color w:val="000000"/>
         </w:rPr>
-        <w:t xml:space="preserve">All results come from one dataset, one brain region and one species. A script to repeat the main analysis on the larger mouse visual cortex Patch-seq release is provided but could not be run here because its count matrix was not reachable from the analysis environment. Transcriptomic types are defined from the transcriptome, partly including channel genes. Clusters built without any channel gene agreed only modestly with the published types and left more residual, so this check cannot exclude some circularity. The calibration assumes a linear, dense or sparse signal over the same genes; a nonlinear relationship could be recovered differently. Fitted model parameters are point estimates from a degenerate posterior, which attenuates raw and residual estimates alike. A learning curve was attempted and is not reported. Subsampling cells shrinks every type, and with fewer than about 10 cells per type both ways of removing type means are biased, in opposite directions, so the curve could not separate effect size from estimation error.</w:t>
+        <w:t xml:space="preserve">All results come from one dataset, one brain region and one species. A script to repeat the main analysis on the larger mouse visual cortex Patch-seq release is provided but could not be run here because its count matrix was not reachable from the analysis environment. Transcriptomic types are defined from the transcriptome, partly including channel genes. Clusters built without any channel gene agreed only modestly with the published types and left more residual, so this check cannot exclude some circularity. The calibration assumes a linear, dense or sparse signal over the same genes; a nonlinear relationship could be recovered differently. Within a type, part of the variance in each electrophysiological feature is recording noise, and part of the variance in expression is sampling noise from the small amount of RNA captured per cell. The dataset has no repeated recordings or technical replicates of the same cell, so the noise ceiling on within-type prediction could not be estimated, and some of the shortfall may reflect measurement rather than biology. Fitted model parameters are point estimates from a degenerate posterior, which attenuates raw and residual estimates alike. A learning curve was attempted and is not reported. Subsampling cells shrinks every type, and with fewer than about 10 cells per type both ways of removing type means are biased, in opposite directions, so the curve could not separate effect size from estimation error.</w:t>
       </w:r>
     </w:p>
     <w:bookmarkEnd w:id="34"/>
@@ -5165,7 +5343,93 @@
         <w:rPr>
           <w:color w:val="000000"/>
         </w:rPr>
-        <w:t xml:space="preserve">For the 13 fitted parameters, the preprocessing of Bernaerts et al. (2025) was reproduced: their Gene Ontology ion channel list (matched by symbol) plus Pvalb, Lamp5, Vip and Sst; exon counts only; genes with at least 10 total counts; counts scaled to the median of the selected genes’ library size; log2(x + 1). This gave 427 genes and 955 cells. The maximum a posteriori parameters are the highest-evaluation posterior sample per cell from their preferred training schedule. Raw, within-type (19 types with at least 15 cells, 668 cells) and within-family (7 families, 942 cells) R² and a 200-permutation within-type null were computed as above, fitting all parameters jointly.</w:t>
+        <w:t xml:space="preserve">For the 13 fitted parameters, the preprocessing of Bernaerts et al. (2025) was reproduced: their Gene Ontology ion channel list (matched by symbol) plus</w:t>
+      </w:r>
+      <w:r>
+        <w:rPr>
+          <w:color w:val="000000"/>
+        </w:rPr>
+        <w:t xml:space="preserve"> </w:t>
+      </w:r>
+      <w:r>
+        <w:rPr>
+          <w:iCs/>
+          <w:i/>
+          <w:color w:val="000000"/>
+        </w:rPr>
+        <w:t xml:space="preserve">Pvalb</w:t>
+      </w:r>
+      <w:r>
+        <w:rPr>
+          <w:color w:val="000000"/>
+        </w:rPr>
+        <w:t xml:space="preserve">,</w:t>
+      </w:r>
+      <w:r>
+        <w:rPr>
+          <w:color w:val="000000"/>
+        </w:rPr>
+        <w:t xml:space="preserve"> </w:t>
+      </w:r>
+      <w:r>
+        <w:rPr>
+          <w:iCs/>
+          <w:i/>
+          <w:color w:val="000000"/>
+        </w:rPr>
+        <w:t xml:space="preserve">Lamp5</w:t>
+      </w:r>
+      <w:r>
+        <w:rPr>
+          <w:color w:val="000000"/>
+        </w:rPr>
+        <w:t xml:space="preserve">,</w:t>
+      </w:r>
+      <w:r>
+        <w:rPr>
+          <w:color w:val="000000"/>
+        </w:rPr>
+        <w:t xml:space="preserve"> </w:t>
+      </w:r>
+      <w:r>
+        <w:rPr>
+          <w:iCs/>
+          <w:i/>
+          <w:color w:val="000000"/>
+        </w:rPr>
+        <w:t xml:space="preserve">Vip</w:t>
+      </w:r>
+      <w:r>
+        <w:rPr>
+          <w:color w:val="000000"/>
+        </w:rPr>
+        <w:t xml:space="preserve"> </w:t>
+      </w:r>
+      <w:r>
+        <w:rPr>
+          <w:color w:val="000000"/>
+        </w:rPr>
+        <w:t xml:space="preserve">and</w:t>
+      </w:r>
+      <w:r>
+        <w:rPr>
+          <w:color w:val="000000"/>
+        </w:rPr>
+        <w:t xml:space="preserve"> </w:t>
+      </w:r>
+      <w:r>
+        <w:rPr>
+          <w:iCs/>
+          <w:i/>
+          <w:color w:val="000000"/>
+        </w:rPr>
+        <w:t xml:space="preserve">Sst</w:t>
+      </w:r>
+      <w:r>
+        <w:rPr>
+          <w:color w:val="000000"/>
+        </w:rPr>
+        <w:t xml:space="preserve">; exon counts only; genes with at least 10 total counts; counts scaled to the median of the selected genes’ library size; log2(x + 1). This gave 427 genes and 955 cells. The maximum a posteriori parameters are the highest-evaluation posterior sample per cell from their preferred training schedule. Raw, within-type (19 types with at least 15 cells, 668 cells) and within-family (7 families, 942 cells) R² and a 200-permutation within-type null were computed as above, fitting all parameters jointly.</w:t>
       </w:r>
     </w:p>
     <w:bookmarkEnd w:id="41"/>
@@ -5237,7 +5501,79 @@
         <w:rPr>
           <w:color w:val="000000"/>
         </w:rPr>
-        <w:t xml:space="preserve">Within type, Hcn1 to Hcn4 were used as the only predictors for seven features and compared with 500 random sets of four other channel genes. Leave-one-gene-out and Hcn1-only fits were also run. The four-gene test and its seven features were fixed before the test was first run.</w:t>
+        <w:t xml:space="preserve">Within type,</w:t>
+      </w:r>
+      <w:r>
+        <w:rPr>
+          <w:color w:val="000000"/>
+        </w:rPr>
+        <w:t xml:space="preserve"> </w:t>
+      </w:r>
+      <w:r>
+        <w:rPr>
+          <w:iCs/>
+          <w:i/>
+          <w:color w:val="000000"/>
+        </w:rPr>
+        <w:t xml:space="preserve">Hcn1</w:t>
+      </w:r>
+      <w:r>
+        <w:rPr>
+          <w:color w:val="000000"/>
+        </w:rPr>
+        <w:t xml:space="preserve"> </w:t>
+      </w:r>
+      <w:r>
+        <w:rPr>
+          <w:color w:val="000000"/>
+        </w:rPr>
+        <w:t xml:space="preserve">to</w:t>
+      </w:r>
+      <w:r>
+        <w:rPr>
+          <w:color w:val="000000"/>
+        </w:rPr>
+        <w:t xml:space="preserve"> </w:t>
+      </w:r>
+      <w:r>
+        <w:rPr>
+          <w:iCs/>
+          <w:i/>
+          <w:color w:val="000000"/>
+        </w:rPr>
+        <w:t xml:space="preserve">Hcn4</w:t>
+      </w:r>
+      <w:r>
+        <w:rPr>
+          <w:color w:val="000000"/>
+        </w:rPr>
+        <w:t xml:space="preserve"> </w:t>
+      </w:r>
+      <w:r>
+        <w:rPr>
+          <w:color w:val="000000"/>
+        </w:rPr>
+        <w:t xml:space="preserve">were used as the only predictors for seven features and compared with 500 random sets of four other channel genes. Leave-one-gene-out and</w:t>
+      </w:r>
+      <w:r>
+        <w:rPr>
+          <w:color w:val="000000"/>
+        </w:rPr>
+        <w:t xml:space="preserve"> </w:t>
+      </w:r>
+      <w:r>
+        <w:rPr>
+          <w:iCs/>
+          <w:i/>
+          <w:color w:val="000000"/>
+        </w:rPr>
+        <w:t xml:space="preserve">Hcn1</w:t>
+      </w:r>
+      <w:r>
+        <w:rPr>
+          <w:color w:val="000000"/>
+        </w:rPr>
+        <w:t xml:space="preserve">-only fits were also run. The four-gene test and its seven features were fixed before the test was first run.</w:t>
       </w:r>
     </w:p>
     <w:bookmarkEnd w:id="44"/>
@@ -5698,7 +6034,85 @@
         <w:rPr>
           <w:color w:val="000000"/>
         </w:rPr>
-        <w:t xml:space="preserve">Within-type R² using Hcn1 to Hcn4 as the only predictors (orange bars), Hcn1 alone (blue dots), and the 95th percentile of 500 random four-gene channel sets (black ticks), with permutation p values.</w:t>
+        <w:t xml:space="preserve">Within-type R² using</w:t>
+      </w:r>
+      <w:r>
+        <w:rPr>
+          <w:color w:val="000000"/>
+        </w:rPr>
+        <w:t xml:space="preserve"> </w:t>
+      </w:r>
+      <w:r>
+        <w:rPr>
+          <w:iCs/>
+          <w:i/>
+          <w:color w:val="000000"/>
+        </w:rPr>
+        <w:t xml:space="preserve">Hcn1</w:t>
+      </w:r>
+      <w:r>
+        <w:rPr>
+          <w:color w:val="000000"/>
+        </w:rPr>
+        <w:t xml:space="preserve"> </w:t>
+      </w:r>
+      <w:r>
+        <w:rPr>
+          <w:color w:val="000000"/>
+        </w:rPr>
+        <w:t xml:space="preserve">to</w:t>
+      </w:r>
+      <w:r>
+        <w:rPr>
+          <w:color w:val="000000"/>
+        </w:rPr>
+        <w:t xml:space="preserve"> </w:t>
+      </w:r>
+      <w:r>
+        <w:rPr>
+          <w:iCs/>
+          <w:i/>
+          <w:color w:val="000000"/>
+        </w:rPr>
+        <w:t xml:space="preserve">Hcn4</w:t>
+      </w:r>
+      <w:r>
+        <w:rPr>
+          <w:color w:val="000000"/>
+        </w:rPr>
+        <w:t xml:space="preserve"> </w:t>
+      </w:r>
+      <w:r>
+        <w:rPr>
+          <w:color w:val="000000"/>
+        </w:rPr>
+        <w:t xml:space="preserve">as the only predictors (orange bars),</w:t>
+      </w:r>
+      <w:r>
+        <w:rPr>
+          <w:color w:val="000000"/>
+        </w:rPr>
+        <w:t xml:space="preserve"> </w:t>
+      </w:r>
+      <w:r>
+        <w:rPr>
+          <w:iCs/>
+          <w:i/>
+          <w:color w:val="000000"/>
+        </w:rPr>
+        <w:t xml:space="preserve">Hcn1</w:t>
+      </w:r>
+      <w:r>
+        <w:rPr>
+          <w:color w:val="000000"/>
+        </w:rPr>
+        <w:t xml:space="preserve"> </w:t>
+      </w:r>
+      <w:r>
+        <w:rPr>
+          <w:color w:val="000000"/>
+        </w:rPr>
+        <w:t xml:space="preserve">alone (blue dots), and the 95th percentile of 500 random four-gene channel sets (black ticks), with permutation p values.</w:t>
       </w:r>
     </w:p>
     <w:bookmarkEnd w:id="64"/>
@@ -5722,7 +6136,7 @@
         <w:rPr>
           <w:color w:val="000000"/>
         </w:rPr>
-        <w:t xml:space="preserve">All input data are public: github.com/berenslab/mini-atlas (Scala et al. 2021) and github.com/berenslab/hh_sbi (Bernaerts et al. 2025). Every analysis script, result table and figure script is available at https://github.com/immortal71/patchseq-within-type under the MIT licence and archived on Zenodo (https://doi.org/10.5281/zenodo.23451340). The visual cortex replication script requires the Allen Institute mouse visual cortex Patch-seq release (Gouwens et al. 2020).</w:t>
+        <w:t xml:space="preserve">All input data are public: github.com/berenslab/mini-atlas (Scala et al. 2021) and github.com/berenslab/hh_sbi (Bernaerts et al. 2025). Every analysis script, result table and figure script is available at https://github.com/immortal71/patchseq-within-type under the MIT license and archived on Zenodo (https://doi.org/10.5281/zenodo.23451340). The visual cortex replication script requires the Allen Institute mouse visual cortex Patch-seq release (Gouwens et al. 2020).</w:t>
       </w:r>
     </w:p>
     <w:bookmarkEnd w:id="65"/>
@@ -5818,7 +6232,7 @@
         <w:rPr>
           <w:color w:val="000000"/>
         </w:rPr>
-        <w:t xml:space="preserve">Benjamini Y, Hochberg Y. Controlling the false discovery rate: a practical and powerful approach to multiple testing. J R Stat Soc Ser B. 1995;57(1):289-300. doi:10.1111/j.2517-6161.1995.tb02031.x</w:t>
+        <w:t xml:space="preserve">Benjamini Y, Hochberg Y. Controlling the false discovery rate: a practical and powerful approach to multiple testing. J R Stat Soc Series B Stat Methodol. 1995;57(1):289-300. doi:10.1111/j.2517-6161.1995.tb02031.x</w:t>
       </w:r>
     </w:p>
     <w:p>
@@ -5829,7 +6243,7 @@
         <w:rPr>
           <w:color w:val="000000"/>
         </w:rPr>
-        <w:t xml:space="preserve">Bernaerts Y, Deistler M, Gonçalves PJ, Beck J, Stimberg M, Scala F, Tolias AS, Macke JH, Kobak D, Berens P. Combined statistical-biophysical modeling links ion channel genes to physiology of cortical neuron types. Patterns. 2025;6(10):101323. doi:10.1016/j.patter.2025.101323</w:t>
+        <w:t xml:space="preserve">Bernaerts Y, Deistler M, Gonçalves PJ, Beck J, Stimberg M, Scala F, et al. Combined statistical-biophysical modeling links ion channel genes to physiology of cortical neuron types. Patterns (N Y). 2025;6(10):101323. doi:10.1016/j.patter.2025.101323</w:t>
       </w:r>
     </w:p>
     <w:p>
@@ -5851,7 +6265,7 @@
         <w:rPr>
           <w:color w:val="000000"/>
         </w:rPr>
-        <w:t xml:space="preserve">Cadwell CR, Palasantza A, Jiang X, et al. Electrophysiological, transcriptomic and morphologic profiling of single neurons using Patch-seq. Nat Biotechnol. 2016;34(2):199-203. doi:10.1038/nbt.3445</w:t>
+        <w:t xml:space="preserve">Cadwell CR, Palasantza A, Jiang X, Berens P, Deng Q, Yilmaz M, et al. Electrophysiological, transcriptomic and morphologic profiling of single neurons using Patch-seq. Nat Biotechnol. 2016;34(2):199-203. doi:10.1038/nbt.3445</w:t>
       </w:r>
     </w:p>
     <w:p>
@@ -5862,7 +6276,7 @@
         <w:rPr>
           <w:color w:val="000000"/>
         </w:rPr>
-        <w:t xml:space="preserve">Fuzik J, Zeisel A, Máté Z, et al. Integration of electrophysiological recordings with single-cell RNA-seq data identifies neuronal subtypes. Nat Biotechnol. 2016;34(2):175-183. doi:10.1038/nbt.3443</w:t>
+        <w:t xml:space="preserve">Fuzik J, Zeisel A, Máté Z, Calvigioni D, Yanagawa Y, Szabó G, et al. Integration of electrophysiological recordings with single-cell RNA-seq data identifies neuronal subtypes. Nat Biotechnol. 2016;34(2):175-83. doi:10.1038/nbt.3443</w:t>
       </w:r>
     </w:p>
     <w:p>
@@ -5873,7 +6287,7 @@
         <w:rPr>
           <w:color w:val="000000"/>
         </w:rPr>
-        <w:t xml:space="preserve">Goaillard JM, Marder E. Ion channel degeneracy, variability, and covariation in neuron and circuit resilience. Annu Rev Neurosci. 2021;44:335-357. doi:10.1146/annurev-neuro-092920-121538</w:t>
+        <w:t xml:space="preserve">Goaillard JM, Marder E. Ion channel degeneracy, variability, and covariation in neuron and circuit resilience. Annu Rev Neurosci. 2021;44:335-57. doi:10.1146/annurev-neuro-092920-121538</w:t>
       </w:r>
     </w:p>
     <w:p>
@@ -5884,7 +6298,7 @@
         <w:rPr>
           <w:color w:val="000000"/>
         </w:rPr>
-        <w:t xml:space="preserve">Gouwens NW, Sorensen SA, Baftizadeh F, et al. Integrated morphoelectric and transcriptomic classification of cortical GABAergic cells. Cell. 2020;183(4):935-953.e19. doi:10.1016/j.cell.2020.09.057</w:t>
+        <w:t xml:space="preserve">Gouwens NW, Sorensen SA, Baftizadeh F, Budzillo A, Lee BR, Jarsky T, et al. Integrated morphoelectric and transcriptomic classification of cortical GABAergic cells. Cell. 2020;183(4):935-53.e19. doi:10.1016/j.cell.2020.09.057</w:t>
       </w:r>
     </w:p>
     <w:p>
@@ -5895,7 +6309,7 @@
         <w:rPr>
           <w:color w:val="000000"/>
         </w:rPr>
-        <w:t xml:space="preserve">Huang W, Xu Q, Liu S. Linking ion channel gene expression to neuronal firing patterns through a statistical-biophysical model. Patterns. 2025;6(10):101390. doi:10.1016/j.patter.2025.101390</w:t>
+        <w:t xml:space="preserve">Huang W, Xu Q, Liu S. Linking ion channel gene expression to neuronal firing patterns through a statistical-biophysical model. Patterns (N Y). 2025;6(10):101390. doi:10.1016/j.patter.2025.101390</w:t>
       </w:r>
     </w:p>
     <w:p>
@@ -5917,7 +6331,7 @@
         <w:rPr>
           <w:color w:val="000000"/>
         </w:rPr>
-        <w:t xml:space="preserve">Lipovsek M, Bardy C, Cadwell CR, Hadley K, Kobak D, Tripathy SJ. Patch-seq: past, present, and future. J Neurosci. 2021;41(5):937-946. doi:10.1523/JNEUROSCI.1653-20.2020</w:t>
+        <w:t xml:space="preserve">Lipovsek M, Bardy C, Cadwell CR, Hadley K, Kobak D, Tripathy SJ. Patch-seq: past, present, and future. J Neurosci. 2021;41(5):937-46. doi:10.1523/JNEUROSCI.1653-20.2020</w:t>
       </w:r>
     </w:p>
     <w:p>
@@ -5928,7 +6342,7 @@
         <w:rPr>
           <w:color w:val="000000"/>
         </w:rPr>
-        <w:t xml:space="preserve">Marder E, Goaillard JM. Variability, compensation and homeostasis in neuron and network function. Nat Rev Neurosci. 2006;7(7):563-574. doi:10.1038/nrn1949</w:t>
+        <w:t xml:space="preserve">Marder E, Goaillard JM. Variability, compensation and homeostasis in neuron and network function. Nat Rev Neurosci. 2006;7(7):563-74. doi:10.1038/nrn1949</w:t>
       </w:r>
     </w:p>
     <w:p>
@@ -5939,7 +6353,7 @@
         <w:rPr>
           <w:color w:val="000000"/>
         </w:rPr>
-        <w:t xml:space="preserve">Prinz AA, Bucher D, Marder E. Similar network activity from disparate circuit parameters. Nat Neurosci. 2004;7(12):1345-1352. doi:10.1038/nn1352</w:t>
+        <w:t xml:space="preserve">Prinz AA, Bucher D, Marder E. Similar network activity from disparate circuit parameters. Nat Neurosci. 2004;7(12):1345-52. doi:10.1038/nn1352</w:t>
       </w:r>
     </w:p>
     <w:p>
@@ -5950,7 +6364,7 @@
         <w:rPr>
           <w:color w:val="000000"/>
         </w:rPr>
-        <w:t xml:space="preserve">Reva M, Arnaudon A, Zbili M, Makkeh A, Markram H, Goaillard JM, Van Geit W. Higher-order interactions in neuronal function: from genes to ionic currents in biophysical models. Proc Natl Acad Sci U S A. 2025;122(40):e2500048122. doi:10.1073/pnas.2500048122</w:t>
+        <w:t xml:space="preserve">Reva M, Arnaudon A, Zbili M, Makkeh A, Markram H, Goaillard JM, et al. Higher-order interactions in neuronal function: from genes to ionic currents in biophysical models. Proc Natl Acad Sci U S A. 2025;122(40):e2500048122. doi:10.1073/pnas.2500048122</w:t>
       </w:r>
     </w:p>
     <w:p>
@@ -5961,7 +6375,7 @@
         <w:rPr>
           <w:color w:val="000000"/>
         </w:rPr>
-        <w:t xml:space="preserve">Scala F, Kobak D, Bernabucci M, et al. Phenotypic variation of transcriptomic cell types in mouse motor cortex. Nature. 2021;598(7879):144-150. doi:10.1038/s41586-020-2907-3</w:t>
+        <w:t xml:space="preserve">Scala F, Kobak D, Bernabucci M, Bernaerts Y, Cadwell CR, Castro JR, et al. Phenotypic variation of transcriptomic cell types in mouse motor cortex. Nature. 2021;598(7879):144-50. doi:10.1038/s41586-020-2907-3</w:t>
       </w:r>
     </w:p>
     <w:p>
@@ -5972,7 +6386,7 @@
         <w:rPr>
           <w:color w:val="000000"/>
         </w:rPr>
-        <w:t xml:space="preserve">Schulz DJ, Goaillard JM, Marder E. Variable channel expression in identified single and electrically coupled neurons in different animals. Nat Neurosci. 2006;9(3):356-362. doi:10.1038/nn1639</w:t>
+        <w:t xml:space="preserve">Schulz DJ, Goaillard JM, Marder E. Variable channel expression in identified single and electrically coupled neurons in different animals. Nat Neurosci. 2006;9(3):356-62. doi:10.1038/nn1639</w:t>
       </w:r>
     </w:p>
     <w:p>
@@ -5983,7 +6397,7 @@
         <w:rPr>
           <w:color w:val="000000"/>
         </w:rPr>
-        <w:t xml:space="preserve">Tripathy SJ, Toker L, Li B, et al. Transcriptomic correlates of neuron electrophysiological diversity. PLoS Comput Biol. 2017;13(10):e1005814. doi:10.1371/journal.pcbi.1005814</w:t>
+        <w:t xml:space="preserve">Tripathy SJ, Toker L, Li B, Crichlow CL, Tebaykin D, Mancarci BO, et al. Transcriptomic correlates of neuron electrophysiological diversity. PLoS Comput Biol. 2017;13(10):e1005814. doi:10.1371/journal.pcbi.1005814</w:t>
       </w:r>
     </w:p>
     <w:bookmarkEnd w:id="69"/>

</xml_diff>